<commit_message>
add Sure v0.7.4 release to portfolio and resume, fix lint errors
</commit_message>
<xml_diff>
--- a/src/resume/resume.docx
+++ b/src/resume/resume.docx
@@ -663,7 +663,7 @@
         </w:numPr>
       </w:pPr>
       <w:r>
-        <w:t xml:space="preserve">Contributed bug fixes and feature improvements to hot repositories — including</w:t>
+        <w:t xml:space="preserve">Contributed bug fixes and feature improvements to hot repositories —</w:t>
       </w:r>
       <w:r>
         <w:t xml:space="preserve"> </w:t>
@@ -673,13 +673,26 @@
           <w:b/>
           <w:bCs/>
         </w:rPr>
-        <w:t xml:space="preserve">Sure v0.7.1–v0.7.3</w:t>
+        <w:t xml:space="preserve">18 merged PRs across Sure v0.7.1–v0.7.4</w:t>
+      </w:r>
+      <w:r>
+        <w:t xml:space="preserve">, ranking</w:t>
       </w:r>
       <w:r>
         <w:t xml:space="preserve"> </w:t>
       </w:r>
       <w:r>
-        <w:t xml:space="preserve">performance work (memoization, N+1 query fixes, and controller optimizations on categories, accounts, and transactions).</w:t>
+        <w:rPr>
+          <w:b/>
+          <w:bCs/>
+        </w:rPr>
+        <w:t xml:space="preserve">#11</w:t>
+      </w:r>
+      <w:r>
+        <w:t xml:space="preserve"> </w:t>
+      </w:r>
+      <w:r>
+        <w:t xml:space="preserve">on the Gittensor leaderboard for v0.7.4 with 11 merged PRs (transfer tags, transaction rule operators, N+1 query fixes, Design System &amp; i18n cleanups).</w:t>
       </w:r>
     </w:p>
     <w:p>

</xml_diff>